<commit_message>
Remove references and rename detailed CV files
Drop the references section from all CV sources and outputs, and rename detailed versions to applicant-name plus format without numbering.

Co-authored-by: Cursor <cursoragent@cursor.com>
</commit_message>
<xml_diff>
--- a/racheal_cv/racheal_nabukeera_cv.docx
+++ b/racheal_cv/racheal_nabukeera_cv.docx
@@ -3020,37 +3020,6 @@
         <w:t>Luganda - Fluent</w:t>
       </w:r>
     </w:p>
-    <w:p>
-      <w:pPr>
-        <w:spacing w:before="200" w:after="80"/>
-        <w:pBdr>
-          <w:bottom w:val="single" w:sz="12" w:space="1" w:color="C9A227"/>
-        </w:pBdr>
-      </w:pPr>
-      <w:r>
-        <w:rPr>
-          <w:rFonts w:ascii="Calibri" w:hAnsi="Calibri" w:eastAsia="Calibri"/>
-          <w:b/>
-          <w:color w:val="0B3D5C"/>
-          <w:sz w:val="22"/>
-        </w:rPr>
-        <w:t>REFERENCES</w:t>
-      </w:r>
-    </w:p>
-    <w:p>
-      <w:pPr>
-        <w:spacing w:before="0" w:after="80" w:line="240" w:lineRule="auto"/>
-      </w:pPr>
-      <w:r>
-        <w:rPr>
-          <w:rFonts w:ascii="Calibri" w:hAnsi="Calibri" w:eastAsia="Calibri"/>
-          <w:b w:val="0"/>
-          <w:color w:val="1F2933"/>
-          <w:sz w:val="19"/>
-        </w:rPr>
-        <w:t>Available upon request.</w:t>
-      </w:r>
-    </w:p>
     <w:sectPr>
       <w:footerReference w:type="default" r:id="rId10"/>
       <w:pgSz w:w="11906" w:h="16838"/>

</xml_diff>